<commit_message>
docs(guide): fix v2.14 date — June 2026 -> July 2026
The v2.14 changes (extract GitHub Actions SLA monitor, PR #79) merged
2026-07-01, not June. Fix the Document Details version line, the v2.14
changelog row, the header, and the footer. v2.13 and earlier entries are
correctly dated June and are untouched.

Co-Authored-By: Claude Opus 4.8 <noreply@anthropic.com>
</commit_message>
<xml_diff>
--- a/Zendesk_PlainLanguage_Implementation_Guide_v2.14.docx
+++ b/Zendesk_PlainLanguage_Implementation_Guide_v2.14.docx
@@ -298,7 +298,7 @@
                 <w:szCs w:val="19"/>
                 <w:lang w:val="en-US"/>
               </w:rPr>
-              <w:t>2.14  —  June 2026</w:t>
+              <w:t>2.14  —  July 2026</w:t>
             </w:r>
           </w:p>
           <w:p wp14:textId="77777777">
@@ -786,7 +786,7 @@
                 <w:sz w:val="17"/>
                 <w:szCs w:val="17"/>
               </w:rPr>
-              <w:t xml:space="preserve">June 2026</w:t>
+              <w:t xml:space="preserve">July 2026</w:t>
             </w:r>
           </w:p>
         </w:tc>
@@ -25865,7 +25865,7 @@
           <w:szCs w:val="20"/>
           <w:lang w:val="en-US"/>
         </w:rPr>
-        <w:t>Plain-Language Implementation Guide  |  Version 2.14  |  June 2026</w:t>
+        <w:t>Plain-Language Implementation Guide  |  Version 2.14  |  July 2026</w:t>
       </w:r>
     </w:p>
     <w:p xmlns:wp14="http://schemas.microsoft.com/office/word/2010/wordml" wp14:textId="77777777">
@@ -26130,7 +26130,7 @@
         <w:szCs w:val="17"/>
         <w:lang w:val="en-US"/>
       </w:rPr>
-      <w:t>v2.14  |  June 2026</w:t>
+      <w:t>v2.14  |  July 2026</w:t>
     </w:r>
   </w:p>
   <w:p xmlns:wp14="http://schemas.microsoft.com/office/word/2010/wordml" wp14:textId="77777777">

</xml_diff>